<commit_message>
Entregas: responsables de los Sprints 1 y 2 según los roles del Sprint 0
El Planning de los dos sprints asignaba responsables por módulo (especificación §4).
Ahora sigue los roles del Avance 1: Joseph, arquitectura e integración; Brayan,
requerimientos y UI/UX; Alejandra, coordinación y documentación; Michael, calidad,
pruebas y despliegue. El borrador del Sprint 2 suma una tabla de tareas por rol y
la pregunta de si los roles rotan. Word del Avance 4 y unificado regenerados.

Co-Authored-By: Claude Opus 5.5 <noreply@anthropic.com>
</commit_message>
<xml_diff>
--- a/docs/entregas/Avance 4 - Sprint 1 - Acopio.docx
+++ b/docs/entregas/Avance 4 - Sprint 1 - Acopio.docx
@@ -1509,110 +1509,19 @@
               <w:rPr>
                 <w:sz w:val="16"/>
               </w:rPr>
-              <w:t xml:space="preserve">Según el reparto de la </w:t>
+              <w:t>Según los roles del Sprint 0 (</w:t>
             </w:r>
             <w:r>
               <w:rPr>
                 <w:sz w:val="16"/>
               </w:rPr>
-              <w:t>especificación §4</w:t>
+              <w:t>Avance 1, §5</w:t>
             </w:r>
             <w:r>
               <w:rPr>
                 <w:sz w:val="16"/>
               </w:rPr>
-              <w:t xml:space="preserve">: Joseph en </w:t>
-            </w:r>
-            <w:r>
-              <w:rPr>
-                <w:rFonts w:ascii="Consolas" w:hAnsi="Consolas"/>
-                <w:sz w:val="13"/>
-              </w:rPr>
-              <w:t>catalogo</w:t>
-            </w:r>
-            <w:r>
-              <w:rPr>
-                <w:sz w:val="16"/>
-              </w:rPr>
-              <w:t xml:space="preserve">, </w:t>
-            </w:r>
-            <w:r>
-              <w:rPr>
-                <w:rFonts w:ascii="Consolas" w:hAnsi="Consolas"/>
-                <w:sz w:val="13"/>
-              </w:rPr>
-              <w:t>inventario</w:t>
-            </w:r>
-            <w:r>
-              <w:rPr>
-                <w:sz w:val="16"/>
-              </w:rPr>
-              <w:t xml:space="preserve">, </w:t>
-            </w:r>
-            <w:r>
-              <w:rPr>
-                <w:rFonts w:ascii="Consolas" w:hAnsi="Consolas"/>
-                <w:sz w:val="13"/>
-              </w:rPr>
-              <w:t>comprobantes</w:t>
-            </w:r>
-            <w:r>
-              <w:rPr>
-                <w:sz w:val="16"/>
-              </w:rPr>
-              <w:t xml:space="preserve"> y </w:t>
-            </w:r>
-            <w:r>
-              <w:rPr>
-                <w:rFonts w:ascii="Consolas" w:hAnsi="Consolas"/>
-                <w:sz w:val="13"/>
-              </w:rPr>
-              <w:t>motor</w:t>
-            </w:r>
-            <w:r>
-              <w:rPr>
-                <w:sz w:val="16"/>
-              </w:rPr>
-              <w:t xml:space="preserve">; Michael en </w:t>
-            </w:r>
-            <w:r>
-              <w:rPr>
-                <w:rFonts w:ascii="Consolas" w:hAnsi="Consolas"/>
-                <w:sz w:val="13"/>
-              </w:rPr>
-              <w:t>identidad</w:t>
-            </w:r>
-            <w:r>
-              <w:rPr>
-                <w:sz w:val="16"/>
-              </w:rPr>
-              <w:t xml:space="preserve"> y </w:t>
-            </w:r>
-            <w:r>
-              <w:rPr>
-                <w:rFonts w:ascii="Consolas" w:hAnsi="Consolas"/>
-                <w:sz w:val="13"/>
-              </w:rPr>
-              <w:t>auditoria</w:t>
-            </w:r>
-            <w:r>
-              <w:rPr>
-                <w:sz w:val="16"/>
-              </w:rPr>
-              <w:t xml:space="preserve">; Alejandra en </w:t>
-            </w:r>
-            <w:r>
-              <w:rPr>
-                <w:rFonts w:ascii="Consolas" w:hAnsi="Consolas"/>
-                <w:sz w:val="13"/>
-              </w:rPr>
-              <w:t>acopios</w:t>
-            </w:r>
-            <w:r>
-              <w:rPr>
-                <w:sz w:val="16"/>
-              </w:rPr>
-              <w:t xml:space="preserve"> y las pantallas del portal P09 a P12; Brayan en las pantallas P01 a P08. En la práctica, Joseph construyó todos los módulos y pantallas del sprint</w:t>
+              <w:t>). Joseph: arquitectura, modelo de datos e integración entre la web y la API. Brayan: requerimientos, criterios de aceptación y diseño de las pantallas en Stitch. Alejandra: planeación y cierre del sprint, tablero y documentación. Michael: pruebas, en especial la de concurrencia del inventario, revisión de código, Docker y despliegue. En la práctica, Joseph construyó todos los módulos y pantallas del sprint</w:t>
             </w:r>
           </w:p>
         </w:tc>
@@ -1888,7 +1797,13 @@
         <w:t>viernes 9 de octubre</w:t>
       </w:r>
       <w:r>
-        <w:t>. Se toma una captura de la videollamada o una foto y cada integrante llena su fila.</w:t>
+        <w:t>, al terminar la clase virtual de las 6:30 p. m. (</w:t>
+      </w:r>
+      <w:r>
+        <w:t>agenda</w:t>
+      </w:r>
+      <w:r>
+        <w:t>). Se toma una captura de la videollamada o una foto y cada integrante llena su fila.</w:t>
       </w:r>
     </w:p>
     <w:tbl>

</xml_diff>

<commit_message>
Avance 4: diagramas de paquetes legibles, capturas de las pruebas y tareas por integrante
- Diagramas de paquetes dibujados a mano en SVG (diagramas/paquetes.html, fuente
  única); exportar-paquetes.mjs saca los PNG. El de la API pasa de 22 flechas a 11
  dependencias directas más dos flechas de grupo hacia auditoria e identidad.
- Anexo del Word: una captura de terminal por prueba (capturas-consola.mjs) en vez
  del texto justificado; captura del tablero del Sprint 1.
- Se quitan del Avance 4 y del borrador del Sprint 2 las menciones sobre quién
  escribió el código.
- Plantilla de issue «Hallazgo de prueba» y cronograma con las tareas de cada
  integrante (#53 a #58) y el servidor de pruebas adelantado a la semana 11.

Co-Authored-By: Claude Opus 5.5 <noreply@anthropic.com>
</commit_message>
<xml_diff>
--- a/docs/entregas/Avance 4 - Sprint 1 - Acopio.docx
+++ b/docs/entregas/Avance 4 - Sprint 1 - Acopio.docx
@@ -894,17 +894,6 @@
       </w:r>
     </w:p>
     <w:p>
-      <w:r>
-        <w:rPr>
-          <w:b/>
-        </w:rPr>
-        <w:t>Sobre la colaboración.</w:t>
-      </w:r>
-      <w:r>
-        <w:t xml:space="preserve"> De los 241 commits del repositorio, 233 son de Joseph. El trabajo de los demás integrantes durante el Sprint 1 está en los issues del Project (revisión de requisitos, diagramas y decisiones), no en código. El documento no lo disimula: lo dice la retrospectiva y la acción del Sprint 2 apunta a eso.</w:t>
-      </w:r>
-    </w:p>
-    <w:p>
       <w:pPr>
         <w:sectPr>
           <w:footerReference w:type="default" r:id="rId8"/>
@@ -936,7 +925,7 @@
         <w:t>Leyenda.</w:t>
       </w:r>
       <w:r>
-        <w:t xml:space="preserve"> «interfaz» es un puerto: un contrato con más de una implementación, elegida por configuración o en las pruebas. «controlador» atiende rutas HTTP, «servicio» tiene la lógica y la transacción y «guard» corre antes de cada petición. La línea continua es una importación en el código; la punteada es una relación que no es un import, como una llamada HTTP o un archivo generado. Las cajas grises son paquetes y las verdes, su contenido.</w:t>
+        <w:t xml:space="preserve"> «interfaz» es un puerto: un contrato con más de una implementación, elegida por configuración o en las pruebas. «controlador» atiende rutas HTTP, «servicio» tiene la lógica y la transacción y «guard» corre antes de cada petición. La línea continua es una importación en el código; la punteada es una relación que no es un import, como una llamada HTTP o un archivo generado. Las cajas grises con pestaña son paquetes y las blancas, su contenido. En el diagrama de la API, las flechas hacia auditoria e identidad salen del grupo de módulos de dominio, porque las importan casi todos.</w:t>
       </w:r>
     </w:p>
     <w:p>
@@ -956,7 +945,7 @@
       <w:r>
         <w:drawing>
           <wp:inline xmlns:a="http://schemas.openxmlformats.org/drawingml/2006/main" xmlns:pic="http://schemas.openxmlformats.org/drawingml/2006/picture">
-            <wp:extent cx="8574844" cy="4896375"/>
+            <wp:extent cx="8963660" cy="4132596"/>
             <wp:docPr id="1" name="Picture 1"/>
             <wp:cNvGraphicFramePr>
               <a:graphicFrameLocks noChangeAspect="1"/>
@@ -977,7 +966,7 @@
                   <pic:spPr>
                     <a:xfrm>
                       <a:off x="0" y="0"/>
-                      <a:ext cx="8574844" cy="4896375"/>
+                      <a:ext cx="8963660" cy="4132596"/>
                     </a:xfrm>
                     <a:prstGeom prst="rect"/>
                   </pic:spPr>
@@ -1057,7 +1046,7 @@
       <w:r>
         <w:drawing>
           <wp:inline xmlns:a="http://schemas.openxmlformats.org/drawingml/2006/main" xmlns:pic="http://schemas.openxmlformats.org/drawingml/2006/picture">
-            <wp:extent cx="6445892" cy="4896375"/>
+            <wp:extent cx="6521442" cy="4896375"/>
             <wp:docPr id="2" name="Picture 2"/>
             <wp:cNvGraphicFramePr>
               <a:graphicFrameLocks noChangeAspect="1"/>
@@ -1078,7 +1067,7 @@
                   <pic:spPr>
                     <a:xfrm>
                       <a:off x="0" y="0"/>
-                      <a:ext cx="6445892" cy="4896375"/>
+                      <a:ext cx="6521442" cy="4896375"/>
                     </a:xfrm>
                     <a:prstGeom prst="rect"/>
                   </pic:spPr>
@@ -1521,7 +1510,7 @@
               <w:rPr>
                 <w:sz w:val="16"/>
               </w:rPr>
-              <w:t>). Joseph: arquitectura, modelo de datos e integración entre la web y la API. Brayan: requerimientos, criterios de aceptación y diseño de las pantallas en Stitch. Alejandra: planeación y cierre del sprint, tablero y documentación. Michael: pruebas, en especial la de concurrencia del inventario, revisión de código, Docker y despliegue. En la práctica, Joseph construyó todos los módulos y pantallas del sprint</w:t>
+              <w:t>). Joseph: arquitectura, modelo de datos e integración entre la web y la API. Brayan: requerimientos, criterios de aceptación y diseño de las pantallas en Stitch. Alejandra: planeación y cierre del sprint, tablero y documentación. Michael: pruebas, en especial la de concurrencia del inventario, revisión de código, Docker y despliegue</w:t>
             </w:r>
           </w:p>
         </w:tc>
@@ -1608,7 +1597,7 @@
               <w:rPr>
                 <w:sz w:val="16"/>
               </w:rPr>
-              <w:t>). Que una sola persona construya todo</w:t>
+              <w:t>)</w:t>
             </w:r>
           </w:p>
         </w:tc>
@@ -1736,41 +1725,66 @@
         <w:spacing w:after="40"/>
       </w:pPr>
     </w:p>
-    <w:tbl>
-      <w:tblPr>
-        <w:tblStyle w:val="Tablaconcuadrcula"/>
-        <w:tblW w:type="auto" w:w="0"/>
+    <w:p>
+      <w:pPr>
+        <w:keepNext/>
+        <w:spacing w:after="40"/>
         <w:jc w:val="center"/>
-        <w:tblLook w:firstColumn="1" w:firstRow="1" w:lastColumn="0" w:lastRow="0" w:noHBand="0" w:noVBand="1" w:val="04A0"/>
-      </w:tblPr>
-      <w:tblGrid>
-        <w:gridCol w:w="9184"/>
-      </w:tblGrid>
-      <w:tr>
-        <w:tc>
-          <w:tcPr>
-            <w:tcW w:type="dxa" w:w="9184"/>
-            <w:shd w:val="clear" w:color="auto" w:fill="FFF4E5"/>
-          </w:tcPr>
-          <w:p>
-            <w:pPr>
-              <w:jc w:val="center"/>
-            </w:pPr>
-            <w:r>
-              <w:rPr>
-                <w:b/>
-                <w:sz w:val="18"/>
-              </w:rPr>
-              <w:t>Pendiente: captura del tablero del Project con las historias del Sprint 1 (evidencia/avance-04/tablero.png).</w:t>
-            </w:r>
-          </w:p>
-        </w:tc>
-      </w:tr>
-    </w:tbl>
+      </w:pPr>
+      <w:r>
+        <w:drawing>
+          <wp:inline xmlns:a="http://schemas.openxmlformats.org/drawingml/2006/main" xmlns:pic="http://schemas.openxmlformats.org/drawingml/2006/picture">
+            <wp:extent cx="5831840" cy="1994623"/>
+            <wp:docPr id="3" name="Picture 3"/>
+            <wp:cNvGraphicFramePr>
+              <a:graphicFrameLocks noChangeAspect="1"/>
+            </wp:cNvGraphicFramePr>
+            <a:graphic>
+              <a:graphicData uri="http://schemas.openxmlformats.org/drawingml/2006/picture">
+                <pic:pic>
+                  <pic:nvPicPr>
+                    <pic:cNvPr id="0" name="tablero.png"/>
+                    <pic:cNvPicPr/>
+                  </pic:nvPicPr>
+                  <pic:blipFill>
+                    <a:blip r:embed="rId29"/>
+                    <a:stretch>
+                      <a:fillRect/>
+                    </a:stretch>
+                  </pic:blipFill>
+                  <pic:spPr>
+                    <a:xfrm>
+                      <a:off x="0" y="0"/>
+                      <a:ext cx="5831840" cy="1994623"/>
+                    </a:xfrm>
+                    <a:prstGeom prst="rect"/>
+                  </pic:spPr>
+                </pic:pic>
+              </a:graphicData>
+            </a:graphic>
+          </wp:inline>
+        </w:drawing>
+      </w:r>
+    </w:p>
     <w:p>
       <w:pPr>
-        <w:spacing w:after="40"/>
-      </w:pPr>
+        <w:jc w:val="center"/>
+      </w:pPr>
+      <w:r>
+        <w:rPr>
+          <w:b/>
+          <w:color w:val="57534E"/>
+          <w:sz w:val="18"/>
+        </w:rPr>
+        <w:t xml:space="preserve">Figura 3. </w:t>
+      </w:r>
+      <w:r>
+        <w:rPr>
+          <w:color w:val="57534E"/>
+          <w:sz w:val="18"/>
+        </w:rPr>
+        <w:t>Tablero del Project con las historias seleccionadas para el Sprint 1.</w:t>
+      </w:r>
     </w:p>
     <w:p>
       <w:pPr>
@@ -3138,7 +3152,7 @@
         <w:t>Qué no funcionó o dificultó el trabajo.</w:t>
       </w:r>
       <w:r>
-        <w:t xml:space="preserve"> Casi todo el código lo escribió una sola persona, y el resto del equipo no tocó el repositorio; si Joseph se detiene, el proyecto se detiene. El tablero del Project dejó de reflejar el trabajo: los bloques se siguieron en los planes de la bóveda y en issues, y las historias nunca llegaron al tablero. Dos historias Must (HU-02 y HU-15) se apartaron en una especificación aparte del Bloque 1 y nadie las volvió a programar, hasta que la revisión del sprint lo encontró.</w:t>
+        <w:t xml:space="preserve"> El tablero del Project dejó de reflejar el trabajo: los bloques se siguieron en los planes de la bóveda y en issues, y las historias nunca llegaron al tablero. Dos historias Must (HU-02 y HU-15) se apartaron en una especificación aparte del Bloque 1 y nadie las volvió a programar, hasta que la revisión del sprint lo encontró.</w:t>
       </w:r>
     </w:p>
     <w:p>
@@ -3198,1140 +3212,500 @@
         <w:t>scripts/pruebas-manuales.sh</w:t>
       </w:r>
       <w:r>
-        <w:t xml:space="preserve"> contra la API levantada con Docker Compose. Cada bloque muestra la petición con curl, el código HTTP y el cuerpo de la respuesta. La contraseña y el token de sesión se reemplazan por asteriscos y por «&lt;token&gt;».</w:t>
-      </w:r>
-    </w:p>
-    <w:tbl>
-      <w:tblPr>
-        <w:tblStyle w:val="Tablaconcuadrcula"/>
-        <w:tblW w:type="auto" w:w="0"/>
-        <w:jc w:val="center"/>
-        <w:tblLook w:firstColumn="1" w:firstRow="1" w:lastColumn="0" w:lastRow="0" w:noHBand="0" w:noVBand="1" w:val="04A0"/>
-      </w:tblPr>
-      <w:tblGrid>
-        <w:gridCol w:w="9184"/>
-      </w:tblGrid>
-      <w:tr>
-        <w:tc>
-          <w:tcPr>
-            <w:tcW w:type="dxa" w:w="9184"/>
-            <w:shd w:val="clear" w:color="auto" w:fill="F5F5F4"/>
-          </w:tcPr>
-          <w:p>
-            <w:pPr>
-              <w:spacing w:after="0"/>
-            </w:pPr>
-            <w:r>
-              <w:rPr>
-                <w:rFonts w:ascii="Consolas" w:hAnsi="Consolas"/>
-                <w:sz w:val="15"/>
-              </w:rPr>
-              <w:t># Pruebas manuales de la API de Acopio</w:t>
-              <w:br/>
-            </w:r>
-            <w:r>
-              <w:rPr>
-                <w:rFonts w:ascii="Consolas" w:hAnsi="Consolas"/>
-                <w:sz w:val="15"/>
-              </w:rPr>
-              <w:t>Fecha: 2026-10-07 14:14 -05 · API: http://localhost:3000/api</w:t>
-              <w:br/>
-            </w:r>
-            <w:r>
-              <w:rPr>
-                <w:rFonts w:ascii="Consolas" w:hAnsi="Consolas"/>
-                <w:sz w:val="15"/>
-              </w:rPr>
-              <w:br/>
-            </w:r>
-            <w:r>
-              <w:rPr>
-                <w:rFonts w:ascii="Consolas" w:hAnsi="Consolas"/>
-                <w:b/>
-                <w:sz w:val="15"/>
-              </w:rPr>
-              <w:t>### 1. Estado del servicio (público)</w:t>
-              <w:br/>
-            </w:r>
-            <w:r>
-              <w:rPr>
-                <w:rFonts w:ascii="Consolas" w:hAnsi="Consolas"/>
-                <w:b/>
-                <w:sz w:val="15"/>
-              </w:rPr>
-              <w:t>$ curl -X GET http://localhost:3000/api/salud</w:t>
-              <w:br/>
-            </w:r>
-            <w:r>
-              <w:rPr>
-                <w:rFonts w:ascii="Consolas" w:hAnsi="Consolas"/>
-                <w:sz w:val="15"/>
-              </w:rPr>
-              <w:t>HTTP 200</w:t>
-              <w:br/>
-            </w:r>
-            <w:r>
-              <w:rPr>
-                <w:rFonts w:ascii="Consolas" w:hAnsi="Consolas"/>
-                <w:sz w:val="15"/>
-              </w:rPr>
-              <w:t>{</w:t>
-              <w:br/>
-            </w:r>
-            <w:r>
-              <w:rPr>
-                <w:rFonts w:ascii="Consolas" w:hAnsi="Consolas"/>
-                <w:sz w:val="15"/>
-              </w:rPr>
-              <w:t xml:space="preserve">  "estado": "ok",</w:t>
-              <w:br/>
-            </w:r>
-            <w:r>
-              <w:rPr>
-                <w:rFonts w:ascii="Consolas" w:hAnsi="Consolas"/>
-                <w:sz w:val="15"/>
-              </w:rPr>
-              <w:t xml:space="preserve">  "base": "ok"</w:t>
-              <w:br/>
-            </w:r>
-            <w:r>
-              <w:rPr>
-                <w:rFonts w:ascii="Consolas" w:hAnsi="Consolas"/>
-                <w:sz w:val="15"/>
-              </w:rPr>
-              <w:t>}</w:t>
-              <w:br/>
-            </w:r>
-            <w:r>
-              <w:rPr>
-                <w:rFonts w:ascii="Consolas" w:hAnsi="Consolas"/>
-                <w:sz w:val="15"/>
-              </w:rPr>
-              <w:br/>
-            </w:r>
-            <w:r>
-              <w:rPr>
-                <w:rFonts w:ascii="Consolas" w:hAnsi="Consolas"/>
-                <w:b/>
-                <w:sz w:val="15"/>
-              </w:rPr>
-              <w:t>### 2. Sin sesión, una ruta protegida responde 401</w:t>
-              <w:br/>
-            </w:r>
-            <w:r>
-              <w:rPr>
-                <w:rFonts w:ascii="Consolas" w:hAnsi="Consolas"/>
-                <w:b/>
-                <w:sz w:val="15"/>
-              </w:rPr>
-              <w:t>$ curl -X GET http://localhost:3000/api/categorias</w:t>
-              <w:br/>
-            </w:r>
-            <w:r>
-              <w:rPr>
-                <w:rFonts w:ascii="Consolas" w:hAnsi="Consolas"/>
-                <w:sz w:val="15"/>
-              </w:rPr>
-              <w:t>HTTP 401</w:t>
-              <w:br/>
-            </w:r>
-            <w:r>
-              <w:rPr>
-                <w:rFonts w:ascii="Consolas" w:hAnsi="Consolas"/>
-                <w:sz w:val="15"/>
-              </w:rPr>
-              <w:t>{</w:t>
-              <w:br/>
-            </w:r>
-            <w:r>
-              <w:rPr>
-                <w:rFonts w:ascii="Consolas" w:hAnsi="Consolas"/>
-                <w:sz w:val="15"/>
-              </w:rPr>
-              <w:t xml:space="preserve">  "estado": 401,</w:t>
-              <w:br/>
-            </w:r>
-            <w:r>
-              <w:rPr>
-                <w:rFonts w:ascii="Consolas" w:hAnsi="Consolas"/>
-                <w:sz w:val="15"/>
-              </w:rPr>
-              <w:t xml:space="preserve">  "codigo": "NO_AUTENTICADO",</w:t>
-              <w:br/>
-            </w:r>
-            <w:r>
-              <w:rPr>
-                <w:rFonts w:ascii="Consolas" w:hAnsi="Consolas"/>
-                <w:sz w:val="15"/>
-              </w:rPr>
-              <w:t xml:space="preserve">  "mensaje": "Falta la sesión"</w:t>
-              <w:br/>
-            </w:r>
-            <w:r>
-              <w:rPr>
-                <w:rFonts w:ascii="Consolas" w:hAnsi="Consolas"/>
-                <w:sz w:val="15"/>
-              </w:rPr>
-              <w:t>}</w:t>
-              <w:br/>
-            </w:r>
-            <w:r>
-              <w:rPr>
-                <w:rFonts w:ascii="Consolas" w:hAnsi="Consolas"/>
-                <w:sz w:val="15"/>
-              </w:rPr>
-              <w:br/>
-            </w:r>
-            <w:r>
-              <w:rPr>
-                <w:rFonts w:ascii="Consolas" w:hAnsi="Consolas"/>
-                <w:b/>
-                <w:sz w:val="15"/>
-              </w:rPr>
-              <w:t>### 3. Inicio de sesión del administrador</w:t>
-              <w:br/>
-            </w:r>
-            <w:r>
-              <w:rPr>
-                <w:rFonts w:ascii="Consolas" w:hAnsi="Consolas"/>
-                <w:b/>
-                <w:sz w:val="15"/>
-              </w:rPr>
-              <w:t>$ curl -X POST http://localhost:3000/api/auth/sesion -H 'Content-Type: application/json' -d '{"usuario":"admin","contrasena":"********"}'</w:t>
-              <w:br/>
-            </w:r>
-            <w:r>
-              <w:rPr>
-                <w:rFonts w:ascii="Consolas" w:hAnsi="Consolas"/>
-                <w:sz w:val="15"/>
-              </w:rPr>
-              <w:t>HTTP/1.1 200 OK</w:t>
-              <w:br/>
-            </w:r>
-            <w:r>
-              <w:rPr>
-                <w:rFonts w:ascii="Consolas" w:hAnsi="Consolas"/>
-                <w:sz w:val="15"/>
-              </w:rPr>
-              <w:t>Set-Cookie: acopio_sesion=&lt;token&gt;; Max-Age=28799; Path=/api; Expires=Thu, 08 Oct 2026 03:14:01 GMT; HttpOnly; SameSite=Strict</w:t>
-              <w:br/>
-            </w:r>
-            <w:r>
-              <w:rPr>
-                <w:rFonts w:ascii="Consolas" w:hAnsi="Consolas"/>
-                <w:sz w:val="15"/>
-              </w:rPr>
-              <w:br/>
-            </w:r>
-            <w:r>
-              <w:rPr>
-                <w:rFonts w:ascii="Consolas" w:hAnsi="Consolas"/>
-                <w:b/>
-                <w:sz w:val="15"/>
-              </w:rPr>
-              <w:t>### 4. Quién soy</w:t>
-              <w:br/>
-            </w:r>
-            <w:r>
-              <w:rPr>
-                <w:rFonts w:ascii="Consolas" w:hAnsi="Consolas"/>
-                <w:b/>
-                <w:sz w:val="15"/>
-              </w:rPr>
-              <w:t>$ curl -X GET http://localhost:3000/api/auth/yo -H 'Authorization: Bearer &lt;token&gt;'</w:t>
-              <w:br/>
-            </w:r>
-            <w:r>
-              <w:rPr>
-                <w:rFonts w:ascii="Consolas" w:hAnsi="Consolas"/>
-                <w:sz w:val="15"/>
-              </w:rPr>
-              <w:t>HTTP 200</w:t>
-              <w:br/>
-            </w:r>
-            <w:r>
-              <w:rPr>
-                <w:rFonts w:ascii="Consolas" w:hAnsi="Consolas"/>
-                <w:sz w:val="15"/>
-              </w:rPr>
-              <w:t>{</w:t>
-              <w:br/>
-            </w:r>
-            <w:r>
-              <w:rPr>
-                <w:rFonts w:ascii="Consolas" w:hAnsi="Consolas"/>
-                <w:sz w:val="15"/>
-              </w:rPr>
-              <w:t xml:space="preserve">  "id": "c17b10e6-f29c-405e-987f-3e883c5b1b8a",</w:t>
-              <w:br/>
-            </w:r>
-            <w:r>
-              <w:rPr>
-                <w:rFonts w:ascii="Consolas" w:hAnsi="Consolas"/>
-                <w:sz w:val="15"/>
-              </w:rPr>
-              <w:t xml:space="preserve">  "username": "admin",</w:t>
-              <w:br/>
-            </w:r>
-            <w:r>
-              <w:rPr>
-                <w:rFonts w:ascii="Consolas" w:hAnsi="Consolas"/>
-                <w:sz w:val="15"/>
-              </w:rPr>
-              <w:t xml:space="preserve">  "nombre": "Administrador",</w:t>
-              <w:br/>
-            </w:r>
-            <w:r>
-              <w:rPr>
-                <w:rFonts w:ascii="Consolas" w:hAnsi="Consolas"/>
-                <w:sz w:val="15"/>
-              </w:rPr>
-              <w:t xml:space="preserve">  "rol": "ADMIN",</w:t>
-              <w:br/>
-            </w:r>
-            <w:r>
-              <w:rPr>
-                <w:rFonts w:ascii="Consolas" w:hAnsi="Consolas"/>
-                <w:sz w:val="15"/>
-              </w:rPr>
-              <w:t xml:space="preserve">  "alcanceGlobal": true,</w:t>
-              <w:br/>
-            </w:r>
-            <w:r>
-              <w:rPr>
-                <w:rFonts w:ascii="Consolas" w:hAnsi="Consolas"/>
-                <w:sz w:val="15"/>
-              </w:rPr>
-              <w:t xml:space="preserve">  "asignaciones": []</w:t>
-              <w:br/>
-            </w:r>
-            <w:r>
-              <w:rPr>
-                <w:rFonts w:ascii="Consolas" w:hAnsi="Consolas"/>
-                <w:sz w:val="15"/>
-              </w:rPr>
-              <w:t>}</w:t>
-              <w:br/>
-            </w:r>
-            <w:r>
-              <w:rPr>
-                <w:rFonts w:ascii="Consolas" w:hAnsi="Consolas"/>
-                <w:sz w:val="15"/>
-              </w:rPr>
-              <w:br/>
-            </w:r>
-            <w:r>
-              <w:rPr>
-                <w:rFonts w:ascii="Consolas" w:hAnsi="Consolas"/>
-                <w:b/>
-                <w:sz w:val="15"/>
-              </w:rPr>
-              <w:t>### 5. Crear una categoría (C de CRUD)</w:t>
-              <w:br/>
-            </w:r>
-            <w:r>
-              <w:rPr>
-                <w:rFonts w:ascii="Consolas" w:hAnsi="Consolas"/>
-                <w:b/>
-                <w:sz w:val="15"/>
-              </w:rPr>
-              <w:t>$ curl -X POST http://localhost:3000/api/categorias -H 'Authorization: Bearer &lt;token&gt;' -H 'Content-Type: application/json' -d '{"nombre":"Pilas AA prueba 141401","grupo":"HERRAMIENTAS","unidadBase":"UNIDAD","sinonimos":["baterías"]}'</w:t>
-              <w:br/>
-            </w:r>
-            <w:r>
-              <w:rPr>
-                <w:rFonts w:ascii="Consolas" w:hAnsi="Consolas"/>
-                <w:sz w:val="15"/>
-              </w:rPr>
-              <w:t>HTTP 201</w:t>
-              <w:br/>
-            </w:r>
-            <w:r>
-              <w:rPr>
-                <w:rFonts w:ascii="Consolas" w:hAnsi="Consolas"/>
-                <w:sz w:val="15"/>
-              </w:rPr>
-              <w:t>{</w:t>
-              <w:br/>
-            </w:r>
-            <w:r>
-              <w:rPr>
-                <w:rFonts w:ascii="Consolas" w:hAnsi="Consolas"/>
-                <w:sz w:val="15"/>
-              </w:rPr>
-              <w:t xml:space="preserve">  "id": "a20cbde5-68fe-4279-8942-d156e67e3b09",</w:t>
-              <w:br/>
-            </w:r>
-            <w:r>
-              <w:rPr>
-                <w:rFonts w:ascii="Consolas" w:hAnsi="Consolas"/>
-                <w:sz w:val="15"/>
-              </w:rPr>
-              <w:t xml:space="preserve">  "nombre": "Pilas AA prueba 141401",</w:t>
-              <w:br/>
-            </w:r>
-            <w:r>
-              <w:rPr>
-                <w:rFonts w:ascii="Consolas" w:hAnsi="Consolas"/>
-                <w:sz w:val="15"/>
-              </w:rPr>
-              <w:t xml:space="preserve">  "grupo": "HERRAMIENTAS",</w:t>
-              <w:br/>
-            </w:r>
-            <w:r>
-              <w:rPr>
-                <w:rFonts w:ascii="Consolas" w:hAnsi="Consolas"/>
-                <w:sz w:val="15"/>
-              </w:rPr>
-              <w:t xml:space="preserve">  "unidadBase": "UNIDAD",</w:t>
-              <w:br/>
-            </w:r>
-            <w:r>
-              <w:rPr>
-                <w:rFonts w:ascii="Consolas" w:hAnsi="Consolas"/>
-                <w:sz w:val="15"/>
-              </w:rPr>
-              <w:t xml:space="preserve">  "perecedero": false,</w:t>
-              <w:br/>
-            </w:r>
-            <w:r>
-              <w:rPr>
-                <w:rFonts w:ascii="Consolas" w:hAnsi="Consolas"/>
-                <w:sz w:val="15"/>
-              </w:rPr>
-              <w:t xml:space="preserve">  "sinonimos": [</w:t>
-              <w:br/>
-            </w:r>
-            <w:r>
-              <w:rPr>
-                <w:rFonts w:ascii="Consolas" w:hAnsi="Consolas"/>
-                <w:sz w:val="15"/>
-              </w:rPr>
-              <w:t xml:space="preserve">    "baterías"</w:t>
-              <w:br/>
-            </w:r>
-            <w:r>
-              <w:rPr>
-                <w:rFonts w:ascii="Consolas" w:hAnsi="Consolas"/>
-                <w:sz w:val="15"/>
-              </w:rPr>
-              <w:t xml:space="preserve">  ],</w:t>
-              <w:br/>
-            </w:r>
-            <w:r>
-              <w:rPr>
-                <w:rFonts w:ascii="Consolas" w:hAnsi="Consolas"/>
-                <w:sz w:val="15"/>
-              </w:rPr>
-              <w:t xml:space="preserve">  "archivada": false</w:t>
-              <w:br/>
-            </w:r>
-            <w:r>
-              <w:rPr>
-                <w:rFonts w:ascii="Consolas" w:hAnsi="Consolas"/>
-                <w:sz w:val="15"/>
-              </w:rPr>
-              <w:t>}</w:t>
-              <w:br/>
-            </w:r>
-            <w:r>
-              <w:rPr>
-                <w:rFonts w:ascii="Consolas" w:hAnsi="Consolas"/>
-                <w:sz w:val="15"/>
-              </w:rPr>
-              <w:br/>
-            </w:r>
-            <w:r>
-              <w:rPr>
-                <w:rFonts w:ascii="Consolas" w:hAnsi="Consolas"/>
-                <w:b/>
-                <w:sz w:val="15"/>
-              </w:rPr>
-              <w:t>### 6. Consultar la categoría creada (R)</w:t>
-              <w:br/>
-            </w:r>
-            <w:r>
-              <w:rPr>
-                <w:rFonts w:ascii="Consolas" w:hAnsi="Consolas"/>
-                <w:b/>
-                <w:sz w:val="15"/>
-              </w:rPr>
-              <w:t>$ curl -X GET http://localhost:3000/api/categorias/a20cbde5-68fe-4279-8942-d156e67e3b09 -H 'Authorization: Bearer &lt;token&gt;'</w:t>
-              <w:br/>
-            </w:r>
-            <w:r>
-              <w:rPr>
-                <w:rFonts w:ascii="Consolas" w:hAnsi="Consolas"/>
-                <w:sz w:val="15"/>
-              </w:rPr>
-              <w:t>HTTP 200</w:t>
-              <w:br/>
-            </w:r>
-            <w:r>
-              <w:rPr>
-                <w:rFonts w:ascii="Consolas" w:hAnsi="Consolas"/>
-                <w:sz w:val="15"/>
-              </w:rPr>
-              <w:t>{</w:t>
-              <w:br/>
-            </w:r>
-            <w:r>
-              <w:rPr>
-                <w:rFonts w:ascii="Consolas" w:hAnsi="Consolas"/>
-                <w:sz w:val="15"/>
-              </w:rPr>
-              <w:t xml:space="preserve">  "id": "a20cbde5-68fe-4279-8942-d156e67e3b09",</w:t>
-              <w:br/>
-            </w:r>
-            <w:r>
-              <w:rPr>
-                <w:rFonts w:ascii="Consolas" w:hAnsi="Consolas"/>
-                <w:sz w:val="15"/>
-              </w:rPr>
-              <w:t xml:space="preserve">  "nombre": "Pilas AA prueba 141401",</w:t>
-              <w:br/>
-            </w:r>
-            <w:r>
-              <w:rPr>
-                <w:rFonts w:ascii="Consolas" w:hAnsi="Consolas"/>
-                <w:sz w:val="15"/>
-              </w:rPr>
-              <w:t xml:space="preserve">  "grupo": "HERRAMIENTAS",</w:t>
-              <w:br/>
-            </w:r>
-            <w:r>
-              <w:rPr>
-                <w:rFonts w:ascii="Consolas" w:hAnsi="Consolas"/>
-                <w:sz w:val="15"/>
-              </w:rPr>
-              <w:t xml:space="preserve">  "unidadBase": "UNIDAD",</w:t>
-              <w:br/>
-            </w:r>
-            <w:r>
-              <w:rPr>
-                <w:rFonts w:ascii="Consolas" w:hAnsi="Consolas"/>
-                <w:sz w:val="15"/>
-              </w:rPr>
-              <w:t xml:space="preserve">  "perecedero": false,</w:t>
-              <w:br/>
-            </w:r>
-            <w:r>
-              <w:rPr>
-                <w:rFonts w:ascii="Consolas" w:hAnsi="Consolas"/>
-                <w:sz w:val="15"/>
-              </w:rPr>
-              <w:t xml:space="preserve">  "sinonimos": [</w:t>
-              <w:br/>
-            </w:r>
-            <w:r>
-              <w:rPr>
-                <w:rFonts w:ascii="Consolas" w:hAnsi="Consolas"/>
-                <w:sz w:val="15"/>
-              </w:rPr>
-              <w:t xml:space="preserve">    "baterías"</w:t>
-              <w:br/>
-            </w:r>
-            <w:r>
-              <w:rPr>
-                <w:rFonts w:ascii="Consolas" w:hAnsi="Consolas"/>
-                <w:sz w:val="15"/>
-              </w:rPr>
-              <w:t xml:space="preserve">  ],</w:t>
-              <w:br/>
-            </w:r>
-            <w:r>
-              <w:rPr>
-                <w:rFonts w:ascii="Consolas" w:hAnsi="Consolas"/>
-                <w:sz w:val="15"/>
-              </w:rPr>
-              <w:t xml:space="preserve">  "archivada": false</w:t>
-              <w:br/>
-            </w:r>
-            <w:r>
-              <w:rPr>
-                <w:rFonts w:ascii="Consolas" w:hAnsi="Consolas"/>
-                <w:sz w:val="15"/>
-              </w:rPr>
-              <w:t>}</w:t>
-              <w:br/>
-            </w:r>
-            <w:r>
-              <w:rPr>
-                <w:rFonts w:ascii="Consolas" w:hAnsi="Consolas"/>
-                <w:sz w:val="15"/>
-              </w:rPr>
-              <w:br/>
-            </w:r>
-            <w:r>
-              <w:rPr>
-                <w:rFonts w:ascii="Consolas" w:hAnsi="Consolas"/>
-                <w:b/>
-                <w:sz w:val="15"/>
-              </w:rPr>
-              <w:t>### 7. Modificarla (U)</w:t>
-              <w:br/>
-            </w:r>
-            <w:r>
-              <w:rPr>
-                <w:rFonts w:ascii="Consolas" w:hAnsi="Consolas"/>
-                <w:b/>
-                <w:sz w:val="15"/>
-              </w:rPr>
-              <w:t>$ curl -X PATCH http://localhost:3000/api/categorias/a20cbde5-68fe-4279-8942-d156e67e3b09 -H 'Authorization: Bearer &lt;token&gt;' -H 'Content-Type: application/json' -d '{"perecedero":false,"sinonimos":["baterías","pilas doble A"]}'</w:t>
-              <w:br/>
-            </w:r>
-            <w:r>
-              <w:rPr>
-                <w:rFonts w:ascii="Consolas" w:hAnsi="Consolas"/>
-                <w:sz w:val="15"/>
-              </w:rPr>
-              <w:t>HTTP 200</w:t>
-              <w:br/>
-            </w:r>
-            <w:r>
-              <w:rPr>
-                <w:rFonts w:ascii="Consolas" w:hAnsi="Consolas"/>
-                <w:sz w:val="15"/>
-              </w:rPr>
-              <w:t>{</w:t>
-              <w:br/>
-            </w:r>
-            <w:r>
-              <w:rPr>
-                <w:rFonts w:ascii="Consolas" w:hAnsi="Consolas"/>
-                <w:sz w:val="15"/>
-              </w:rPr>
-              <w:t xml:space="preserve">  "id": "a20cbde5-68fe-4279-8942-d156e67e3b09",</w:t>
-              <w:br/>
-            </w:r>
-            <w:r>
-              <w:rPr>
-                <w:rFonts w:ascii="Consolas" w:hAnsi="Consolas"/>
-                <w:sz w:val="15"/>
-              </w:rPr>
-              <w:t xml:space="preserve">  "nombre": "Pilas AA prueba 141401",</w:t>
-              <w:br/>
-            </w:r>
-            <w:r>
-              <w:rPr>
-                <w:rFonts w:ascii="Consolas" w:hAnsi="Consolas"/>
-                <w:sz w:val="15"/>
-              </w:rPr>
-              <w:t xml:space="preserve">  "grupo": "HERRAMIENTAS",</w:t>
-              <w:br/>
-            </w:r>
-            <w:r>
-              <w:rPr>
-                <w:rFonts w:ascii="Consolas" w:hAnsi="Consolas"/>
-                <w:sz w:val="15"/>
-              </w:rPr>
-              <w:t xml:space="preserve">  "unidadBase": "UNIDAD",</w:t>
-              <w:br/>
-            </w:r>
-            <w:r>
-              <w:rPr>
-                <w:rFonts w:ascii="Consolas" w:hAnsi="Consolas"/>
-                <w:sz w:val="15"/>
-              </w:rPr>
-              <w:t xml:space="preserve">  "perecedero": false,</w:t>
-              <w:br/>
-            </w:r>
-            <w:r>
-              <w:rPr>
-                <w:rFonts w:ascii="Consolas" w:hAnsi="Consolas"/>
-                <w:sz w:val="15"/>
-              </w:rPr>
-              <w:t xml:space="preserve">  "sinonimos": [</w:t>
-              <w:br/>
-            </w:r>
-            <w:r>
-              <w:rPr>
-                <w:rFonts w:ascii="Consolas" w:hAnsi="Consolas"/>
-                <w:sz w:val="15"/>
-              </w:rPr>
-              <w:t xml:space="preserve">    "baterías",</w:t>
-              <w:br/>
-            </w:r>
-            <w:r>
-              <w:rPr>
-                <w:rFonts w:ascii="Consolas" w:hAnsi="Consolas"/>
-                <w:sz w:val="15"/>
-              </w:rPr>
-              <w:t xml:space="preserve">    "pilas doble A"</w:t>
-              <w:br/>
-            </w:r>
-            <w:r>
-              <w:rPr>
-                <w:rFonts w:ascii="Consolas" w:hAnsi="Consolas"/>
-                <w:sz w:val="15"/>
-              </w:rPr>
-              <w:t xml:space="preserve">  ],</w:t>
-              <w:br/>
-            </w:r>
-            <w:r>
-              <w:rPr>
-                <w:rFonts w:ascii="Consolas" w:hAnsi="Consolas"/>
-                <w:sz w:val="15"/>
-              </w:rPr>
-              <w:t xml:space="preserve">  "archivada": false</w:t>
-              <w:br/>
-            </w:r>
-            <w:r>
-              <w:rPr>
-                <w:rFonts w:ascii="Consolas" w:hAnsi="Consolas"/>
-                <w:sz w:val="15"/>
-              </w:rPr>
-              <w:t>}</w:t>
-              <w:br/>
-            </w:r>
-            <w:r>
-              <w:rPr>
-                <w:rFonts w:ascii="Consolas" w:hAnsi="Consolas"/>
-                <w:sz w:val="15"/>
-              </w:rPr>
-              <w:br/>
-            </w:r>
-            <w:r>
-              <w:rPr>
-                <w:rFonts w:ascii="Consolas" w:hAnsi="Consolas"/>
-                <w:b/>
-                <w:sz w:val="15"/>
-              </w:rPr>
-              <w:t>### 8. Validación: falta la unidad base, responde 400 con el detalle</w:t>
-              <w:br/>
-            </w:r>
-            <w:r>
-              <w:rPr>
-                <w:rFonts w:ascii="Consolas" w:hAnsi="Consolas"/>
-                <w:b/>
-                <w:sz w:val="15"/>
-              </w:rPr>
-              <w:t>$ curl -X POST http://localhost:3000/api/categorias -H 'Authorization: Bearer &lt;token&gt;' -H 'Content-Type: application/json' -d '{"nombre":"Sin unidad","grupo":"HERRAMIENTAS"}'</w:t>
-              <w:br/>
-            </w:r>
-            <w:r>
-              <w:rPr>
-                <w:rFonts w:ascii="Consolas" w:hAnsi="Consolas"/>
-                <w:sz w:val="15"/>
-              </w:rPr>
-              <w:t>HTTP 400</w:t>
-              <w:br/>
-            </w:r>
-            <w:r>
-              <w:rPr>
-                <w:rFonts w:ascii="Consolas" w:hAnsi="Consolas"/>
-                <w:sz w:val="15"/>
-              </w:rPr>
-              <w:t>{</w:t>
-              <w:br/>
-            </w:r>
-            <w:r>
-              <w:rPr>
-                <w:rFonts w:ascii="Consolas" w:hAnsi="Consolas"/>
-                <w:sz w:val="15"/>
-              </w:rPr>
-              <w:t xml:space="preserve">  "estado": 400,</w:t>
-              <w:br/>
-            </w:r>
-            <w:r>
-              <w:rPr>
-                <w:rFonts w:ascii="Consolas" w:hAnsi="Consolas"/>
-                <w:sz w:val="15"/>
-              </w:rPr>
-              <w:t xml:space="preserve">  "codigo": "VALIDACION",</w:t>
-              <w:br/>
-            </w:r>
-            <w:r>
-              <w:rPr>
-                <w:rFonts w:ascii="Consolas" w:hAnsi="Consolas"/>
-                <w:sz w:val="15"/>
-              </w:rPr>
-              <w:t xml:space="preserve">  "mensaje": "Hay datos inválidos en la solicitud",</w:t>
-              <w:br/>
-            </w:r>
-            <w:r>
-              <w:rPr>
-                <w:rFonts w:ascii="Consolas" w:hAnsi="Consolas"/>
-                <w:sz w:val="15"/>
-              </w:rPr>
-              <w:t xml:space="preserve">  "detalles": [</w:t>
-              <w:br/>
-            </w:r>
-            <w:r>
-              <w:rPr>
-                <w:rFonts w:ascii="Consolas" w:hAnsi="Consolas"/>
-                <w:sz w:val="15"/>
-              </w:rPr>
-              <w:t xml:space="preserve">    {</w:t>
-              <w:br/>
-            </w:r>
-            <w:r>
-              <w:rPr>
-                <w:rFonts w:ascii="Consolas" w:hAnsi="Consolas"/>
-                <w:sz w:val="15"/>
-              </w:rPr>
-              <w:t xml:space="preserve">      "campo": "unidadBase",</w:t>
-              <w:br/>
-            </w:r>
-            <w:r>
-              <w:rPr>
-                <w:rFonts w:ascii="Consolas" w:hAnsi="Consolas"/>
-                <w:sz w:val="15"/>
-              </w:rPr>
-              <w:t xml:space="preserve">      "mensaje": "Opción inválida: se esperaba una de \"LITRO\"|\"KILOGRAMO\"|\"UNIDAD\""</w:t>
-              <w:br/>
-            </w:r>
-            <w:r>
-              <w:rPr>
-                <w:rFonts w:ascii="Consolas" w:hAnsi="Consolas"/>
-                <w:sz w:val="15"/>
-              </w:rPr>
-              <w:t xml:space="preserve">    }</w:t>
-              <w:br/>
-            </w:r>
-            <w:r>
-              <w:rPr>
-                <w:rFonts w:ascii="Consolas" w:hAnsi="Consolas"/>
-                <w:sz w:val="15"/>
-              </w:rPr>
-              <w:t xml:space="preserve">  ]</w:t>
-              <w:br/>
-            </w:r>
-            <w:r>
-              <w:rPr>
-                <w:rFonts w:ascii="Consolas" w:hAnsi="Consolas"/>
-                <w:sz w:val="15"/>
-              </w:rPr>
-              <w:t>}</w:t>
-              <w:br/>
-            </w:r>
-            <w:r>
-              <w:rPr>
-                <w:rFonts w:ascii="Consolas" w:hAnsi="Consolas"/>
-                <w:sz w:val="15"/>
-              </w:rPr>
-              <w:br/>
-            </w:r>
-            <w:r>
-              <w:rPr>
-                <w:rFonts w:ascii="Consolas" w:hAnsi="Consolas"/>
-                <w:b/>
-                <w:sz w:val="15"/>
-              </w:rPr>
-              <w:t>### 9. Borrarla (D)</w:t>
-              <w:br/>
-            </w:r>
-            <w:r>
-              <w:rPr>
-                <w:rFonts w:ascii="Consolas" w:hAnsi="Consolas"/>
-                <w:b/>
-                <w:sz w:val="15"/>
-              </w:rPr>
-              <w:t>$ curl -X DELETE http://localhost:3000/api/categorias/a20cbde5-68fe-4279-8942-d156e67e3b09 -H 'Authorization: Bearer &lt;token&gt;'</w:t>
-              <w:br/>
-            </w:r>
-            <w:r>
-              <w:rPr>
-                <w:rFonts w:ascii="Consolas" w:hAnsi="Consolas"/>
-                <w:sz w:val="15"/>
-              </w:rPr>
-              <w:t>HTTP 204</w:t>
-              <w:br/>
-            </w:r>
-            <w:r>
-              <w:rPr>
-                <w:rFonts w:ascii="Consolas" w:hAnsi="Consolas"/>
-                <w:sz w:val="15"/>
-              </w:rPr>
-              <w:t>(sin cuerpo)</w:t>
-              <w:br/>
-            </w:r>
-            <w:r>
-              <w:rPr>
-                <w:rFonts w:ascii="Consolas" w:hAnsi="Consolas"/>
-                <w:sz w:val="15"/>
-              </w:rPr>
-              <w:br/>
-            </w:r>
-            <w:r>
-              <w:rPr>
-                <w:rFonts w:ascii="Consolas" w:hAnsi="Consolas"/>
-                <w:b/>
-                <w:sz w:val="15"/>
-              </w:rPr>
-              <w:t>### 10. Ya no existe: 404 con el formato único de error</w:t>
-              <w:br/>
-            </w:r>
-            <w:r>
-              <w:rPr>
-                <w:rFonts w:ascii="Consolas" w:hAnsi="Consolas"/>
-                <w:b/>
-                <w:sz w:val="15"/>
-              </w:rPr>
-              <w:t>$ curl -X GET http://localhost:3000/api/categorias/a20cbde5-68fe-4279-8942-d156e67e3b09 -H 'Authorization: Bearer &lt;token&gt;'</w:t>
-              <w:br/>
-            </w:r>
-            <w:r>
-              <w:rPr>
-                <w:rFonts w:ascii="Consolas" w:hAnsi="Consolas"/>
-                <w:sz w:val="15"/>
-              </w:rPr>
-              <w:t>HTTP 404</w:t>
-              <w:br/>
-            </w:r>
-            <w:r>
-              <w:rPr>
-                <w:rFonts w:ascii="Consolas" w:hAnsi="Consolas"/>
-                <w:sz w:val="15"/>
-              </w:rPr>
-              <w:t>{</w:t>
-              <w:br/>
-            </w:r>
-            <w:r>
-              <w:rPr>
-                <w:rFonts w:ascii="Consolas" w:hAnsi="Consolas"/>
-                <w:sz w:val="15"/>
-              </w:rPr>
-              <w:t xml:space="preserve">  "estado": 404,</w:t>
-              <w:br/>
-            </w:r>
-            <w:r>
-              <w:rPr>
-                <w:rFonts w:ascii="Consolas" w:hAnsi="Consolas"/>
-                <w:sz w:val="15"/>
-              </w:rPr>
-              <w:t xml:space="preserve">  "codigo": "CATEGORIA_NO_ENCONTRADA",</w:t>
-              <w:br/>
-            </w:r>
-            <w:r>
-              <w:rPr>
-                <w:rFonts w:ascii="Consolas" w:hAnsi="Consolas"/>
-                <w:sz w:val="15"/>
-              </w:rPr>
-              <w:t xml:space="preserve">  "mensaje": "La categoría no existe"</w:t>
-              <w:br/>
-            </w:r>
-            <w:r>
-              <w:rPr>
-                <w:rFonts w:ascii="Consolas" w:hAnsi="Consolas"/>
-                <w:sz w:val="15"/>
-              </w:rPr>
-              <w:t>}</w:t>
-              <w:br/>
-            </w:r>
-            <w:r>
-              <w:rPr>
-                <w:rFonts w:ascii="Consolas" w:hAnsi="Consolas"/>
-                <w:sz w:val="15"/>
-              </w:rPr>
-              <w:br/>
-            </w:r>
-            <w:r>
-              <w:rPr>
-                <w:rFonts w:ascii="Consolas" w:hAnsi="Consolas"/>
-                <w:b/>
-                <w:sz w:val="15"/>
-              </w:rPr>
-              <w:t>### 11. Seguimiento público de un folio que no existe: mensaje genérico</w:t>
-              <w:br/>
-            </w:r>
-            <w:r>
-              <w:rPr>
-                <w:rFonts w:ascii="Consolas" w:hAnsi="Consolas"/>
-                <w:b/>
-                <w:sz w:val="15"/>
-              </w:rPr>
-              <w:t>$ curl -X GET http://localhost:3000/api/seguimiento/DON-0000-0000</w:t>
-              <w:br/>
-            </w:r>
-            <w:r>
-              <w:rPr>
-                <w:rFonts w:ascii="Consolas" w:hAnsi="Consolas"/>
-                <w:sz w:val="15"/>
-              </w:rPr>
-              <w:t>HTTP 404</w:t>
-              <w:br/>
-            </w:r>
-            <w:r>
-              <w:rPr>
-                <w:rFonts w:ascii="Consolas" w:hAnsi="Consolas"/>
-                <w:sz w:val="15"/>
-              </w:rPr>
-              <w:t>{</w:t>
-              <w:br/>
-            </w:r>
-            <w:r>
-              <w:rPr>
-                <w:rFonts w:ascii="Consolas" w:hAnsi="Consolas"/>
-                <w:sz w:val="15"/>
-              </w:rPr>
-              <w:t xml:space="preserve">  "estado": 404,</w:t>
-              <w:br/>
-            </w:r>
-            <w:r>
-              <w:rPr>
-                <w:rFonts w:ascii="Consolas" w:hAnsi="Consolas"/>
-                <w:sz w:val="15"/>
-              </w:rPr>
-              <w:t xml:space="preserve">  "codigo": "FOLIO_NO_ENCONTRADO",</w:t>
-              <w:br/>
-            </w:r>
-            <w:r>
-              <w:rPr>
-                <w:rFonts w:ascii="Consolas" w:hAnsi="Consolas"/>
-                <w:sz w:val="15"/>
-              </w:rPr>
-              <w:t xml:space="preserve">  "mensaje": "No encontramos ese folio"</w:t>
-              <w:br/>
-            </w:r>
-            <w:r>
-              <w:rPr>
-                <w:rFonts w:ascii="Consolas" w:hAnsi="Consolas"/>
-                <w:sz w:val="15"/>
-              </w:rPr>
-              <w:t>}</w:t>
-            </w:r>
-          </w:p>
-        </w:tc>
-      </w:tr>
-    </w:tbl>
-    <w:p>
-      <w:pPr>
-        <w:spacing w:after="40"/>
-      </w:pPr>
-    </w:p>
-    <w:p>
-      <w:pPr>
-        <w:pStyle w:val="Ttulo2"/>
-      </w:pPr>
-      <w:r>
-        <w:t>Contenedores y volúmenes</w:t>
+        <w:t xml:space="preserve"> contra la API levantada con Docker Compose, una captura por prueba: la petición con curl, el código HTTP y el cuerpo de la respuesta. La contraseña y el token de sesión se reemplazan por asteriscos y por «&lt;token&gt;». La última captura muestra los contenedores del Compose en estado «healthy» y los volúmenes donde persisten la base y los archivos.</w:t>
       </w:r>
     </w:p>
     <w:p>
+      <w:pPr>
+        <w:keepNext/>
+        <w:spacing w:after="200"/>
+        <w:jc w:val="center"/>
+      </w:pPr>
       <w:r>
-        <w:t xml:space="preserve">Salida de </w:t>
-      </w:r>
-      <w:r>
-        <w:rPr>
-          <w:rFonts w:ascii="Consolas" w:hAnsi="Consolas"/>
-          <w:sz w:val="19"/>
-        </w:rPr>
-        <w:t>docker ps</w:t>
-      </w:r>
-      <w:r>
-        <w:t xml:space="preserve"> y </w:t>
-      </w:r>
-      <w:r>
-        <w:rPr>
-          <w:rFonts w:ascii="Consolas" w:hAnsi="Consolas"/>
-          <w:sz w:val="19"/>
-        </w:rPr>
-        <w:t>docker volume ls</w:t>
-      </w:r>
-      <w:r>
-        <w:t xml:space="preserve"> el mismo día: los cuatro servicios del Compose en estado «healthy» y los volúmenes donde persisten la base y los archivos.</w:t>
+        <w:drawing>
+          <wp:inline xmlns:a="http://schemas.openxmlformats.org/drawingml/2006/main" xmlns:pic="http://schemas.openxmlformats.org/drawingml/2006/picture">
+            <wp:extent cx="5831840" cy="1213836"/>
+            <wp:docPr id="4" name="Picture 4"/>
+            <wp:cNvGraphicFramePr>
+              <a:graphicFrameLocks noChangeAspect="1"/>
+            </wp:cNvGraphicFramePr>
+            <a:graphic>
+              <a:graphicData uri="http://schemas.openxmlformats.org/drawingml/2006/picture">
+                <pic:pic>
+                  <pic:nvPicPr>
+                    <pic:cNvPr id="0" name="01.png"/>
+                    <pic:cNvPicPr/>
+                  </pic:nvPicPr>
+                  <pic:blipFill>
+                    <a:blip r:embed="rId30"/>
+                    <a:stretch>
+                      <a:fillRect/>
+                    </a:stretch>
+                  </pic:blipFill>
+                  <pic:spPr>
+                    <a:xfrm>
+                      <a:off x="0" y="0"/>
+                      <a:ext cx="5831840" cy="1213836"/>
+                    </a:xfrm>
+                    <a:prstGeom prst="rect"/>
+                  </pic:spPr>
+                </pic:pic>
+              </a:graphicData>
+            </a:graphic>
+          </wp:inline>
+        </w:drawing>
       </w:r>
     </w:p>
-    <w:tbl>
-      <w:tblPr>
-        <w:tblStyle w:val="Tablaconcuadrcula"/>
-        <w:tblW w:type="auto" w:w="0"/>
+    <w:p>
+      <w:pPr>
+        <w:keepNext/>
+        <w:spacing w:after="200"/>
         <w:jc w:val="center"/>
-        <w:tblLook w:firstColumn="1" w:firstRow="1" w:lastColumn="0" w:lastRow="0" w:noHBand="0" w:noVBand="1" w:val="04A0"/>
-      </w:tblPr>
-      <w:tblGrid>
-        <w:gridCol w:w="9184"/>
-      </w:tblGrid>
-      <w:tr>
-        <w:tc>
-          <w:tcPr>
-            <w:tcW w:type="dxa" w:w="9184"/>
-            <w:shd w:val="clear" w:color="auto" w:fill="F5F5F4"/>
-          </w:tcPr>
-          <w:p>
-            <w:pPr>
-              <w:spacing w:after="0"/>
-            </w:pPr>
-            <w:r>
-              <w:rPr>
-                <w:rFonts w:ascii="Consolas" w:hAnsi="Consolas"/>
-                <w:sz w:val="15"/>
-              </w:rPr>
-              <w:t>NAMES               IMAGE                    STATUS                 PORTS</w:t>
-              <w:br/>
-            </w:r>
-            <w:r>
-              <w:rPr>
-                <w:rFonts w:ascii="Consolas" w:hAnsi="Consolas"/>
-                <w:sz w:val="15"/>
-              </w:rPr>
-              <w:t>acopio-api-1        acopio-api               Up 4 hours (healthy)   0.0.0.0:3000-&gt;3000/tcp, [::]:3000-&gt;3000/tcp</w:t>
-              <w:br/>
-            </w:r>
-            <w:r>
-              <w:rPr>
-                <w:rFonts w:ascii="Consolas" w:hAnsi="Consolas"/>
-                <w:sz w:val="15"/>
-              </w:rPr>
-              <w:t>acopio-db-1         postgres:16-alpine       Up 4 hours (healthy)   0.0.0.0:5440-&gt;5432/tcp, [::]:5440-&gt;5432/tcp</w:t>
-              <w:br/>
-            </w:r>
-            <w:r>
-              <w:rPr>
-                <w:rFonts w:ascii="Consolas" w:hAnsi="Consolas"/>
-                <w:sz w:val="15"/>
-              </w:rPr>
-              <w:t>acopio-storage-1    dxflrs/garage:v2.4.1     Up 4 hours (healthy)   0.0.0.0:3900-&gt;3900/tcp, [::]:3900-&gt;3900/tcp</w:t>
-              <w:br/>
-            </w:r>
-            <w:r>
-              <w:rPr>
-                <w:rFonts w:ascii="Consolas" w:hAnsi="Consolas"/>
-                <w:sz w:val="15"/>
-              </w:rPr>
-              <w:t>acopio-mailpit-1    axllent/mailpit:latest   Up 4 hours (healthy)   0.0.0.0:1025-&gt;1025/tcp, [::]:1025-&gt;1025/tcp, 0.0.0.0:8025-&gt;8025/tcp, [::]:8025-&gt;8025/tcp, 1110/tcp</w:t>
-              <w:br/>
-            </w:r>
-            <w:r>
-              <w:rPr>
-                <w:rFonts w:ascii="Consolas" w:hAnsi="Consolas"/>
-                <w:sz w:val="15"/>
-              </w:rPr>
-              <w:t>acopio_garagedata</w:t>
-              <w:br/>
-            </w:r>
-            <w:r>
-              <w:rPr>
-                <w:rFonts w:ascii="Consolas" w:hAnsi="Consolas"/>
-                <w:sz w:val="15"/>
-              </w:rPr>
-              <w:t>acopio_garagemeta</w:t>
-              <w:br/>
-            </w:r>
-            <w:r>
-              <w:rPr>
-                <w:rFonts w:ascii="Consolas" w:hAnsi="Consolas"/>
-                <w:sz w:val="15"/>
-              </w:rPr>
-              <w:t>acopio_llaves</w:t>
-              <w:br/>
-            </w:r>
-            <w:r>
-              <w:rPr>
-                <w:rFonts w:ascii="Consolas" w:hAnsi="Consolas"/>
-                <w:sz w:val="15"/>
-              </w:rPr>
-              <w:t>acopio_pgdata</w:t>
-            </w:r>
-          </w:p>
-        </w:tc>
-      </w:tr>
-    </w:tbl>
+      </w:pPr>
+      <w:r>
+        <w:drawing>
+          <wp:inline xmlns:a="http://schemas.openxmlformats.org/drawingml/2006/main" xmlns:pic="http://schemas.openxmlformats.org/drawingml/2006/picture">
+            <wp:extent cx="5831840" cy="1349461"/>
+            <wp:docPr id="5" name="Picture 5"/>
+            <wp:cNvGraphicFramePr>
+              <a:graphicFrameLocks noChangeAspect="1"/>
+            </wp:cNvGraphicFramePr>
+            <a:graphic>
+              <a:graphicData uri="http://schemas.openxmlformats.org/drawingml/2006/picture">
+                <pic:pic>
+                  <pic:nvPicPr>
+                    <pic:cNvPr id="0" name="02.png"/>
+                    <pic:cNvPicPr/>
+                  </pic:nvPicPr>
+                  <pic:blipFill>
+                    <a:blip r:embed="rId31"/>
+                    <a:stretch>
+                      <a:fillRect/>
+                    </a:stretch>
+                  </pic:blipFill>
+                  <pic:spPr>
+                    <a:xfrm>
+                      <a:off x="0" y="0"/>
+                      <a:ext cx="5831840" cy="1349461"/>
+                    </a:xfrm>
+                    <a:prstGeom prst="rect"/>
+                  </pic:spPr>
+                </pic:pic>
+              </a:graphicData>
+            </a:graphic>
+          </wp:inline>
+        </w:drawing>
+      </w:r>
+    </w:p>
     <w:p>
       <w:pPr>
-        <w:spacing w:after="40"/>
-      </w:pPr>
+        <w:keepNext/>
+        <w:spacing w:after="200"/>
+        <w:jc w:val="center"/>
+      </w:pPr>
+      <w:r>
+        <w:drawing>
+          <wp:inline xmlns:a="http://schemas.openxmlformats.org/drawingml/2006/main" xmlns:pic="http://schemas.openxmlformats.org/drawingml/2006/picture">
+            <wp:extent cx="5831840" cy="1084993"/>
+            <wp:docPr id="6" name="Picture 6"/>
+            <wp:cNvGraphicFramePr>
+              <a:graphicFrameLocks noChangeAspect="1"/>
+            </wp:cNvGraphicFramePr>
+            <a:graphic>
+              <a:graphicData uri="http://schemas.openxmlformats.org/drawingml/2006/picture">
+                <pic:pic>
+                  <pic:nvPicPr>
+                    <pic:cNvPr id="0" name="03.png"/>
+                    <pic:cNvPicPr/>
+                  </pic:nvPicPr>
+                  <pic:blipFill>
+                    <a:blip r:embed="rId32"/>
+                    <a:stretch>
+                      <a:fillRect/>
+                    </a:stretch>
+                  </pic:blipFill>
+                  <pic:spPr>
+                    <a:xfrm>
+                      <a:off x="0" y="0"/>
+                      <a:ext cx="5831840" cy="1084993"/>
+                    </a:xfrm>
+                    <a:prstGeom prst="rect"/>
+                  </pic:spPr>
+                </pic:pic>
+              </a:graphicData>
+            </a:graphic>
+          </wp:inline>
+        </w:drawing>
+      </w:r>
+    </w:p>
+    <w:p>
+      <w:pPr>
+        <w:keepNext/>
+        <w:spacing w:after="200"/>
+        <w:jc w:val="center"/>
+      </w:pPr>
+      <w:r>
+        <w:drawing>
+          <wp:inline xmlns:a="http://schemas.openxmlformats.org/drawingml/2006/main" xmlns:pic="http://schemas.openxmlformats.org/drawingml/2006/picture">
+            <wp:extent cx="5831840" cy="1742771"/>
+            <wp:docPr id="7" name="Picture 7"/>
+            <wp:cNvGraphicFramePr>
+              <a:graphicFrameLocks noChangeAspect="1"/>
+            </wp:cNvGraphicFramePr>
+            <a:graphic>
+              <a:graphicData uri="http://schemas.openxmlformats.org/drawingml/2006/picture">
+                <pic:pic>
+                  <pic:nvPicPr>
+                    <pic:cNvPr id="0" name="04.png"/>
+                    <pic:cNvPicPr/>
+                  </pic:nvPicPr>
+                  <pic:blipFill>
+                    <a:blip r:embed="rId33"/>
+                    <a:stretch>
+                      <a:fillRect/>
+                    </a:stretch>
+                  </pic:blipFill>
+                  <pic:spPr>
+                    <a:xfrm>
+                      <a:off x="0" y="0"/>
+                      <a:ext cx="5831840" cy="1742771"/>
+                    </a:xfrm>
+                    <a:prstGeom prst="rect"/>
+                  </pic:spPr>
+                </pic:pic>
+              </a:graphicData>
+            </a:graphic>
+          </wp:inline>
+        </w:drawing>
+      </w:r>
+    </w:p>
+    <w:p>
+      <w:pPr>
+        <w:keepNext/>
+        <w:spacing w:after="200"/>
+        <w:jc w:val="center"/>
+      </w:pPr>
+      <w:r>
+        <w:drawing>
+          <wp:inline xmlns:a="http://schemas.openxmlformats.org/drawingml/2006/main" xmlns:pic="http://schemas.openxmlformats.org/drawingml/2006/picture">
+            <wp:extent cx="5831840" cy="2407329"/>
+            <wp:docPr id="8" name="Picture 8"/>
+            <wp:cNvGraphicFramePr>
+              <a:graphicFrameLocks noChangeAspect="1"/>
+            </wp:cNvGraphicFramePr>
+            <a:graphic>
+              <a:graphicData uri="http://schemas.openxmlformats.org/drawingml/2006/picture">
+                <pic:pic>
+                  <pic:nvPicPr>
+                    <pic:cNvPr id="0" name="05.png"/>
+                    <pic:cNvPicPr/>
+                  </pic:nvPicPr>
+                  <pic:blipFill>
+                    <a:blip r:embed="rId34"/>
+                    <a:stretch>
+                      <a:fillRect/>
+                    </a:stretch>
+                  </pic:blipFill>
+                  <pic:spPr>
+                    <a:xfrm>
+                      <a:off x="0" y="0"/>
+                      <a:ext cx="5831840" cy="2407329"/>
+                    </a:xfrm>
+                    <a:prstGeom prst="rect"/>
+                  </pic:spPr>
+                </pic:pic>
+              </a:graphicData>
+            </a:graphic>
+          </wp:inline>
+        </w:drawing>
+      </w:r>
+    </w:p>
+    <w:p>
+      <w:pPr>
+        <w:keepNext/>
+        <w:spacing w:after="200"/>
+        <w:jc w:val="center"/>
+      </w:pPr>
+      <w:r>
+        <w:drawing>
+          <wp:inline xmlns:a="http://schemas.openxmlformats.org/drawingml/2006/main" xmlns:pic="http://schemas.openxmlformats.org/drawingml/2006/picture">
+            <wp:extent cx="5831840" cy="2271705"/>
+            <wp:docPr id="9" name="Picture 9"/>
+            <wp:cNvGraphicFramePr>
+              <a:graphicFrameLocks noChangeAspect="1"/>
+            </wp:cNvGraphicFramePr>
+            <a:graphic>
+              <a:graphicData uri="http://schemas.openxmlformats.org/drawingml/2006/picture">
+                <pic:pic>
+                  <pic:nvPicPr>
+                    <pic:cNvPr id="0" name="06.png"/>
+                    <pic:cNvPicPr/>
+                  </pic:nvPicPr>
+                  <pic:blipFill>
+                    <a:blip r:embed="rId35"/>
+                    <a:stretch>
+                      <a:fillRect/>
+                    </a:stretch>
+                  </pic:blipFill>
+                  <pic:spPr>
+                    <a:xfrm>
+                      <a:off x="0" y="0"/>
+                      <a:ext cx="5831840" cy="2271705"/>
+                    </a:xfrm>
+                    <a:prstGeom prst="rect"/>
+                  </pic:spPr>
+                </pic:pic>
+              </a:graphicData>
+            </a:graphic>
+          </wp:inline>
+        </w:drawing>
+      </w:r>
+    </w:p>
+    <w:p>
+      <w:pPr>
+        <w:keepNext/>
+        <w:spacing w:after="200"/>
+        <w:jc w:val="center"/>
+      </w:pPr>
+      <w:r>
+        <w:drawing>
+          <wp:inline xmlns:a="http://schemas.openxmlformats.org/drawingml/2006/main" xmlns:pic="http://schemas.openxmlformats.org/drawingml/2006/picture">
+            <wp:extent cx="5831840" cy="2536172"/>
+            <wp:docPr id="10" name="Picture 10"/>
+            <wp:cNvGraphicFramePr>
+              <a:graphicFrameLocks noChangeAspect="1"/>
+            </wp:cNvGraphicFramePr>
+            <a:graphic>
+              <a:graphicData uri="http://schemas.openxmlformats.org/drawingml/2006/picture">
+                <pic:pic>
+                  <pic:nvPicPr>
+                    <pic:cNvPr id="0" name="07.png"/>
+                    <pic:cNvPicPr/>
+                  </pic:nvPicPr>
+                  <pic:blipFill>
+                    <a:blip r:embed="rId36"/>
+                    <a:stretch>
+                      <a:fillRect/>
+                    </a:stretch>
+                  </pic:blipFill>
+                  <pic:spPr>
+                    <a:xfrm>
+                      <a:off x="0" y="0"/>
+                      <a:ext cx="5831840" cy="2536172"/>
+                    </a:xfrm>
+                    <a:prstGeom prst="rect"/>
+                  </pic:spPr>
+                </pic:pic>
+              </a:graphicData>
+            </a:graphic>
+          </wp:inline>
+        </w:drawing>
+      </w:r>
+    </w:p>
+    <w:p>
+      <w:pPr>
+        <w:keepNext/>
+        <w:spacing w:after="200"/>
+        <w:jc w:val="center"/>
+      </w:pPr>
+      <w:r>
+        <w:drawing>
+          <wp:inline xmlns:a="http://schemas.openxmlformats.org/drawingml/2006/main" xmlns:pic="http://schemas.openxmlformats.org/drawingml/2006/picture">
+            <wp:extent cx="5831840" cy="2271705"/>
+            <wp:docPr id="11" name="Picture 11"/>
+            <wp:cNvGraphicFramePr>
+              <a:graphicFrameLocks noChangeAspect="1"/>
+            </wp:cNvGraphicFramePr>
+            <a:graphic>
+              <a:graphicData uri="http://schemas.openxmlformats.org/drawingml/2006/picture">
+                <pic:pic>
+                  <pic:nvPicPr>
+                    <pic:cNvPr id="0" name="08.png"/>
+                    <pic:cNvPicPr/>
+                  </pic:nvPicPr>
+                  <pic:blipFill>
+                    <a:blip r:embed="rId37"/>
+                    <a:stretch>
+                      <a:fillRect/>
+                    </a:stretch>
+                  </pic:blipFill>
+                  <pic:spPr>
+                    <a:xfrm>
+                      <a:off x="0" y="0"/>
+                      <a:ext cx="5831840" cy="2271705"/>
+                    </a:xfrm>
+                    <a:prstGeom prst="rect"/>
+                  </pic:spPr>
+                </pic:pic>
+              </a:graphicData>
+            </a:graphic>
+          </wp:inline>
+        </w:drawing>
+      </w:r>
+    </w:p>
+    <w:p>
+      <w:pPr>
+        <w:keepNext/>
+        <w:spacing w:after="200"/>
+        <w:jc w:val="center"/>
+      </w:pPr>
+      <w:r>
+        <w:drawing>
+          <wp:inline xmlns:a="http://schemas.openxmlformats.org/drawingml/2006/main" xmlns:pic="http://schemas.openxmlformats.org/drawingml/2006/picture">
+            <wp:extent cx="5831840" cy="949369"/>
+            <wp:docPr id="12" name="Picture 12"/>
+            <wp:cNvGraphicFramePr>
+              <a:graphicFrameLocks noChangeAspect="1"/>
+            </wp:cNvGraphicFramePr>
+            <a:graphic>
+              <a:graphicData uri="http://schemas.openxmlformats.org/drawingml/2006/picture">
+                <pic:pic>
+                  <pic:nvPicPr>
+                    <pic:cNvPr id="0" name="09.png"/>
+                    <pic:cNvPicPr/>
+                  </pic:nvPicPr>
+                  <pic:blipFill>
+                    <a:blip r:embed="rId38"/>
+                    <a:stretch>
+                      <a:fillRect/>
+                    </a:stretch>
+                  </pic:blipFill>
+                  <pic:spPr>
+                    <a:xfrm>
+                      <a:off x="0" y="0"/>
+                      <a:ext cx="5831840" cy="949369"/>
+                    </a:xfrm>
+                    <a:prstGeom prst="rect"/>
+                  </pic:spPr>
+                </pic:pic>
+              </a:graphicData>
+            </a:graphic>
+          </wp:inline>
+        </w:drawing>
+      </w:r>
+    </w:p>
+    <w:p>
+      <w:pPr>
+        <w:keepNext/>
+        <w:spacing w:after="200"/>
+        <w:jc w:val="center"/>
+      </w:pPr>
+      <w:r>
+        <w:drawing>
+          <wp:inline xmlns:a="http://schemas.openxmlformats.org/drawingml/2006/main" xmlns:pic="http://schemas.openxmlformats.org/drawingml/2006/picture">
+            <wp:extent cx="5831840" cy="1478304"/>
+            <wp:docPr id="13" name="Picture 13"/>
+            <wp:cNvGraphicFramePr>
+              <a:graphicFrameLocks noChangeAspect="1"/>
+            </wp:cNvGraphicFramePr>
+            <a:graphic>
+              <a:graphicData uri="http://schemas.openxmlformats.org/drawingml/2006/picture">
+                <pic:pic>
+                  <pic:nvPicPr>
+                    <pic:cNvPr id="0" name="10.png"/>
+                    <pic:cNvPicPr/>
+                  </pic:nvPicPr>
+                  <pic:blipFill>
+                    <a:blip r:embed="rId39"/>
+                    <a:stretch>
+                      <a:fillRect/>
+                    </a:stretch>
+                  </pic:blipFill>
+                  <pic:spPr>
+                    <a:xfrm>
+                      <a:off x="0" y="0"/>
+                      <a:ext cx="5831840" cy="1478304"/>
+                    </a:xfrm>
+                    <a:prstGeom prst="rect"/>
+                  </pic:spPr>
+                </pic:pic>
+              </a:graphicData>
+            </a:graphic>
+          </wp:inline>
+        </w:drawing>
+      </w:r>
+    </w:p>
+    <w:p>
+      <w:pPr>
+        <w:keepNext/>
+        <w:spacing w:after="200"/>
+        <w:jc w:val="center"/>
+      </w:pPr>
+      <w:r>
+        <w:drawing>
+          <wp:inline xmlns:a="http://schemas.openxmlformats.org/drawingml/2006/main" xmlns:pic="http://schemas.openxmlformats.org/drawingml/2006/picture">
+            <wp:extent cx="5831840" cy="1349461"/>
+            <wp:docPr id="14" name="Picture 14"/>
+            <wp:cNvGraphicFramePr>
+              <a:graphicFrameLocks noChangeAspect="1"/>
+            </wp:cNvGraphicFramePr>
+            <a:graphic>
+              <a:graphicData uri="http://schemas.openxmlformats.org/drawingml/2006/picture">
+                <pic:pic>
+                  <pic:nvPicPr>
+                    <pic:cNvPr id="0" name="11.png"/>
+                    <pic:cNvPicPr/>
+                  </pic:nvPicPr>
+                  <pic:blipFill>
+                    <a:blip r:embed="rId40"/>
+                    <a:stretch>
+                      <a:fillRect/>
+                    </a:stretch>
+                  </pic:blipFill>
+                  <pic:spPr>
+                    <a:xfrm>
+                      <a:off x="0" y="0"/>
+                      <a:ext cx="5831840" cy="1349461"/>
+                    </a:xfrm>
+                    <a:prstGeom prst="rect"/>
+                  </pic:spPr>
+                </pic:pic>
+              </a:graphicData>
+            </a:graphic>
+          </wp:inline>
+        </w:drawing>
+      </w:r>
+    </w:p>
+    <w:p>
+      <w:pPr>
+        <w:keepNext/>
+        <w:spacing w:after="200"/>
+        <w:jc w:val="center"/>
+      </w:pPr>
+      <w:r>
+        <w:drawing>
+          <wp:inline xmlns:a="http://schemas.openxmlformats.org/drawingml/2006/main" xmlns:pic="http://schemas.openxmlformats.org/drawingml/2006/picture">
+            <wp:extent cx="5831840" cy="2142862"/>
+            <wp:docPr id="15" name="Picture 15"/>
+            <wp:cNvGraphicFramePr>
+              <a:graphicFrameLocks noChangeAspect="1"/>
+            </wp:cNvGraphicFramePr>
+            <a:graphic>
+              <a:graphicData uri="http://schemas.openxmlformats.org/drawingml/2006/picture">
+                <pic:pic>
+                  <pic:nvPicPr>
+                    <pic:cNvPr id="0" name="12.png"/>
+                    <pic:cNvPicPr/>
+                  </pic:nvPicPr>
+                  <pic:blipFill>
+                    <a:blip r:embed="rId41"/>
+                    <a:stretch>
+                      <a:fillRect/>
+                    </a:stretch>
+                  </pic:blipFill>
+                  <pic:spPr>
+                    <a:xfrm>
+                      <a:off x="0" y="0"/>
+                      <a:ext cx="5831840" cy="2142862"/>
+                    </a:xfrm>
+                    <a:prstGeom prst="rect"/>
+                  </pic:spPr>
+                </pic:pic>
+              </a:graphicData>
+            </a:graphic>
+          </wp:inline>
+        </w:drawing>
+      </w:r>
     </w:p>
     <w:sectPr>
       <w:pgSz w:w="11906" w:h="16838"/>

</xml_diff>

<commit_message>
Avance 4: diagramas y capturas de las pruebas en tema claro
Co-Authored-By: Claude Opus 5.5 <noreply@anthropic.com>
</commit_message>
<xml_diff>
--- a/docs/entregas/Avance 4 - Sprint 1 - Acopio.docx
+++ b/docs/entregas/Avance 4 - Sprint 1 - Acopio.docx
@@ -3224,7 +3224,7 @@
       <w:r>
         <w:drawing>
           <wp:inline xmlns:a="http://schemas.openxmlformats.org/drawingml/2006/main" xmlns:pic="http://schemas.openxmlformats.org/drawingml/2006/picture">
-            <wp:extent cx="5831840" cy="1213836"/>
+            <wp:extent cx="5831840" cy="1238082"/>
             <wp:docPr id="4" name="Picture 4"/>
             <wp:cNvGraphicFramePr>
               <a:graphicFrameLocks noChangeAspect="1"/>
@@ -3245,7 +3245,7 @@
                   <pic:spPr>
                     <a:xfrm>
                       <a:off x="0" y="0"/>
-                      <a:ext cx="5831840" cy="1213836"/>
+                      <a:ext cx="5831840" cy="1238082"/>
                     </a:xfrm>
                     <a:prstGeom prst="rect"/>
                   </pic:spPr>
@@ -3265,7 +3265,7 @@
       <w:r>
         <w:drawing>
           <wp:inline xmlns:a="http://schemas.openxmlformats.org/drawingml/2006/main" xmlns:pic="http://schemas.openxmlformats.org/drawingml/2006/picture">
-            <wp:extent cx="5831840" cy="1349461"/>
+            <wp:extent cx="5831840" cy="1373392"/>
             <wp:docPr id="5" name="Picture 5"/>
             <wp:cNvGraphicFramePr>
               <a:graphicFrameLocks noChangeAspect="1"/>
@@ -3286,7 +3286,7 @@
                   <pic:spPr>
                     <a:xfrm>
                       <a:off x="0" y="0"/>
-                      <a:ext cx="5831840" cy="1349461"/>
+                      <a:ext cx="5831840" cy="1373392"/>
                     </a:xfrm>
                     <a:prstGeom prst="rect"/>
                   </pic:spPr>
@@ -3306,7 +3306,7 @@
       <w:r>
         <w:drawing>
           <wp:inline xmlns:a="http://schemas.openxmlformats.org/drawingml/2006/main" xmlns:pic="http://schemas.openxmlformats.org/drawingml/2006/picture">
-            <wp:extent cx="5831840" cy="1084993"/>
+            <wp:extent cx="5831840" cy="1109538"/>
             <wp:docPr id="6" name="Picture 6"/>
             <wp:cNvGraphicFramePr>
               <a:graphicFrameLocks noChangeAspect="1"/>
@@ -3327,7 +3327,7 @@
                   <pic:spPr>
                     <a:xfrm>
                       <a:off x="0" y="0"/>
-                      <a:ext cx="5831840" cy="1084993"/>
+                      <a:ext cx="5831840" cy="1109538"/>
                     </a:xfrm>
                     <a:prstGeom prst="rect"/>
                   </pic:spPr>
@@ -3347,7 +3347,7 @@
       <w:r>
         <w:drawing>
           <wp:inline xmlns:a="http://schemas.openxmlformats.org/drawingml/2006/main" xmlns:pic="http://schemas.openxmlformats.org/drawingml/2006/picture">
-            <wp:extent cx="5831840" cy="1742771"/>
+            <wp:extent cx="5831840" cy="1765789"/>
             <wp:docPr id="7" name="Picture 7"/>
             <wp:cNvGraphicFramePr>
               <a:graphicFrameLocks noChangeAspect="1"/>
@@ -3368,7 +3368,7 @@
                   <pic:spPr>
                     <a:xfrm>
                       <a:off x="0" y="0"/>
-                      <a:ext cx="5831840" cy="1742771"/>
+                      <a:ext cx="5831840" cy="1765789"/>
                     </a:xfrm>
                     <a:prstGeom prst="rect"/>
                   </pic:spPr>
@@ -3388,7 +3388,7 @@
       <w:r>
         <w:drawing>
           <wp:inline xmlns:a="http://schemas.openxmlformats.org/drawingml/2006/main" xmlns:pic="http://schemas.openxmlformats.org/drawingml/2006/picture">
-            <wp:extent cx="5831840" cy="2407329"/>
+            <wp:extent cx="5831840" cy="2428806"/>
             <wp:docPr id="8" name="Picture 8"/>
             <wp:cNvGraphicFramePr>
               <a:graphicFrameLocks noChangeAspect="1"/>
@@ -3409,7 +3409,7 @@
                   <pic:spPr>
                     <a:xfrm>
                       <a:off x="0" y="0"/>
-                      <a:ext cx="5831840" cy="2407329"/>
+                      <a:ext cx="5831840" cy="2428806"/>
                     </a:xfrm>
                     <a:prstGeom prst="rect"/>
                   </pic:spPr>
@@ -3429,7 +3429,7 @@
       <w:r>
         <w:drawing>
           <wp:inline xmlns:a="http://schemas.openxmlformats.org/drawingml/2006/main" xmlns:pic="http://schemas.openxmlformats.org/drawingml/2006/picture">
-            <wp:extent cx="5831840" cy="2271705"/>
+            <wp:extent cx="5831840" cy="2293496"/>
             <wp:docPr id="9" name="Picture 9"/>
             <wp:cNvGraphicFramePr>
               <a:graphicFrameLocks noChangeAspect="1"/>
@@ -3450,7 +3450,7 @@
                   <pic:spPr>
                     <a:xfrm>
                       <a:off x="0" y="0"/>
-                      <a:ext cx="5831840" cy="2271705"/>
+                      <a:ext cx="5831840" cy="2293496"/>
                     </a:xfrm>
                     <a:prstGeom prst="rect"/>
                   </pic:spPr>
@@ -3470,7 +3470,7 @@
       <w:r>
         <w:drawing>
           <wp:inline xmlns:a="http://schemas.openxmlformats.org/drawingml/2006/main" xmlns:pic="http://schemas.openxmlformats.org/drawingml/2006/picture">
-            <wp:extent cx="5831840" cy="2536172"/>
+            <wp:extent cx="5831840" cy="2557350"/>
             <wp:docPr id="10" name="Picture 10"/>
             <wp:cNvGraphicFramePr>
               <a:graphicFrameLocks noChangeAspect="1"/>
@@ -3491,7 +3491,7 @@
                   <pic:spPr>
                     <a:xfrm>
                       <a:off x="0" y="0"/>
-                      <a:ext cx="5831840" cy="2536172"/>
+                      <a:ext cx="5831840" cy="2557350"/>
                     </a:xfrm>
                     <a:prstGeom prst="rect"/>
                   </pic:spPr>
@@ -3511,7 +3511,7 @@
       <w:r>
         <w:drawing>
           <wp:inline xmlns:a="http://schemas.openxmlformats.org/drawingml/2006/main" xmlns:pic="http://schemas.openxmlformats.org/drawingml/2006/picture">
-            <wp:extent cx="5831840" cy="2271705"/>
+            <wp:extent cx="5831840" cy="2293496"/>
             <wp:docPr id="11" name="Picture 11"/>
             <wp:cNvGraphicFramePr>
               <a:graphicFrameLocks noChangeAspect="1"/>
@@ -3532,7 +3532,7 @@
                   <pic:spPr>
                     <a:xfrm>
                       <a:off x="0" y="0"/>
-                      <a:ext cx="5831840" cy="2271705"/>
+                      <a:ext cx="5831840" cy="2293496"/>
                     </a:xfrm>
                     <a:prstGeom prst="rect"/>
                   </pic:spPr>
@@ -3552,7 +3552,7 @@
       <w:r>
         <w:drawing>
           <wp:inline xmlns:a="http://schemas.openxmlformats.org/drawingml/2006/main" xmlns:pic="http://schemas.openxmlformats.org/drawingml/2006/picture">
-            <wp:extent cx="5831840" cy="949369"/>
+            <wp:extent cx="5831840" cy="974228"/>
             <wp:docPr id="12" name="Picture 12"/>
             <wp:cNvGraphicFramePr>
               <a:graphicFrameLocks noChangeAspect="1"/>
@@ -3573,7 +3573,7 @@
                   <pic:spPr>
                     <a:xfrm>
                       <a:off x="0" y="0"/>
-                      <a:ext cx="5831840" cy="949369"/>
+                      <a:ext cx="5831840" cy="974228"/>
                     </a:xfrm>
                     <a:prstGeom prst="rect"/>
                   </pic:spPr>
@@ -3593,7 +3593,7 @@
       <w:r>
         <w:drawing>
           <wp:inline xmlns:a="http://schemas.openxmlformats.org/drawingml/2006/main" xmlns:pic="http://schemas.openxmlformats.org/drawingml/2006/picture">
-            <wp:extent cx="5831840" cy="1478304"/>
+            <wp:extent cx="5831840" cy="1501936"/>
             <wp:docPr id="13" name="Picture 13"/>
             <wp:cNvGraphicFramePr>
               <a:graphicFrameLocks noChangeAspect="1"/>
@@ -3614,7 +3614,7 @@
                   <pic:spPr>
                     <a:xfrm>
                       <a:off x="0" y="0"/>
-                      <a:ext cx="5831840" cy="1478304"/>
+                      <a:ext cx="5831840" cy="1501936"/>
                     </a:xfrm>
                     <a:prstGeom prst="rect"/>
                   </pic:spPr>
@@ -3634,7 +3634,7 @@
       <w:r>
         <w:drawing>
           <wp:inline xmlns:a="http://schemas.openxmlformats.org/drawingml/2006/main" xmlns:pic="http://schemas.openxmlformats.org/drawingml/2006/picture">
-            <wp:extent cx="5831840" cy="1349461"/>
+            <wp:extent cx="5831840" cy="1373392"/>
             <wp:docPr id="14" name="Picture 14"/>
             <wp:cNvGraphicFramePr>
               <a:graphicFrameLocks noChangeAspect="1"/>
@@ -3655,7 +3655,7 @@
                   <pic:spPr>
                     <a:xfrm>
                       <a:off x="0" y="0"/>
-                      <a:ext cx="5831840" cy="1349461"/>
+                      <a:ext cx="5831840" cy="1373392"/>
                     </a:xfrm>
                     <a:prstGeom prst="rect"/>
                   </pic:spPr>
@@ -3675,7 +3675,7 @@
       <w:r>
         <w:drawing>
           <wp:inline xmlns:a="http://schemas.openxmlformats.org/drawingml/2006/main" xmlns:pic="http://schemas.openxmlformats.org/drawingml/2006/picture">
-            <wp:extent cx="5831840" cy="2142862"/>
+            <wp:extent cx="5831840" cy="2164952"/>
             <wp:docPr id="15" name="Picture 15"/>
             <wp:cNvGraphicFramePr>
               <a:graphicFrameLocks noChangeAspect="1"/>
@@ -3696,7 +3696,7 @@
                   <pic:spPr>
                     <a:xfrm>
                       <a:off x="0" y="0"/>
-                      <a:ext cx="5831840" cy="2142862"/>
+                      <a:ext cx="5831840" cy="2164952"/>
                     </a:xfrm>
                     <a:prstGeom prst="rect"/>
                   </pic:spPr>

</xml_diff>